<commit_message>
Add Baird & Maruping and Berente et al. references
Co-Authored-By: Claude Sonnet 5.5 <noreply@anthropic.com>
Claude-Session: https://claude.ai/code/session_019ks96x9sC8NinrPq6pHnnp
</commit_message>
<xml_diff>
--- a/ISR_manuscript_draft_5.docx
+++ b/ISR_manuscript_draft_5.docx
@@ -3200,6 +3200,58 @@
       </w:r>
       <w:r>
         <w:t xml:space="preserve">(99:394), pp. 116-131.</w:t>
+      </w:r>
+    </w:p>
+    <w:p>
+      <w:pPr>
+        <w:pStyle w:val="BodyText"/>
+      </w:pPr>
+      <w:r>
+        <w:t xml:space="preserve">Baird, A., and Maruping, L. M. 2021.</w:t>
+      </w:r>
+      <w:r>
+        <w:t xml:space="preserve"> </w:t>
+      </w:r>
+      <w:r>
+        <w:t xml:space="preserve">“</w:t>
+      </w:r>
+      <w:r>
+        <w:t xml:space="preserve">The Next Generation of Research on IS Use: A Theoretical Framework of Delegation to and from Agentic IS Artifacts,</w:t>
+      </w:r>
+      <w:r>
+        <w:t xml:space="preserve">”</w:t>
+      </w:r>
+      <w:r>
+        <w:t xml:space="preserve"> </w:t>
+      </w:r>
+      <w:r>
+        <w:t xml:space="preserve">MIS Quarterly (45:1), pp. 315-341.</w:t>
+      </w:r>
+    </w:p>
+    <w:p>
+      <w:pPr>
+        <w:pStyle w:val="BodyText"/>
+      </w:pPr>
+      <w:r>
+        <w:t xml:space="preserve">Berente, N., Gu, B., Recker, J., and Santhanam, R. 2021.</w:t>
+      </w:r>
+      <w:r>
+        <w:t xml:space="preserve"> </w:t>
+      </w:r>
+      <w:r>
+        <w:t xml:space="preserve">“</w:t>
+      </w:r>
+      <w:r>
+        <w:t xml:space="preserve">Special Issue Editor’s Comments: Managing Artificial Intelligence,</w:t>
+      </w:r>
+      <w:r>
+        <w:t xml:space="preserve">”</w:t>
+      </w:r>
+      <w:r>
+        <w:t xml:space="preserve"> </w:t>
+      </w:r>
+      <w:r>
+        <w:t xml:space="preserve">MIS Quarterly (45:3), pp. 1433-1450.</w:t>
       </w:r>
     </w:p>
     <w:p>

</xml_diff>

<commit_message>
Revise Figure 1 and 2 descriptions to three stages
Co-Authored-By: Claude Sonnet 5.5 <noreply@anthropic.com>
Claude-Session: https://claude.ai/code/session_019ks96x9sC8NinrPq6pHnnp
</commit_message>
<xml_diff>
--- a/ISR_manuscript_draft_5.docx
+++ b/ISR_manuscript_draft_5.docx
@@ -502,15 +502,15 @@
         <w:pStyle w:val="BodyText"/>
       </w:pPr>
       <w:r>
-        <w:t xml:space="preserve">[Path diagram of the conceptual model, arranged in three stages: office rents and agent capability or family lead to candidacy (Stage 1); authority binding, moderated by office rents, leads to inequality of access (Stage 2); the election rule leads to persistence of control (Stage 3). A note beneath each stage names the capture-logic and specification-logic prediction.]</w:t>
-      </w:r>
-    </w:p>
-    <w:p>
-      <w:pPr>
-        <w:pStyle w:val="BodyText"/>
-      </w:pPr>
-      <w:r>
-        <w:t xml:space="preserve">Figure 1. Conceptual model and propositions. Solid arrows are main-effect propositions; the dotted arrow is the moderation of the authority effect by office rents (P3). Signs show the direction predicted by the capture logic.</w:t>
+        <w:t xml:space="preserve">[Path diagram of the conceptual model, arranged left to right in three labeled stages. Stage 1, Selection (contest): office rents (+, P1) and agent capability or family (+, P5) lead to candidacy and electoral competition. Stage 2, Exercise (capture): authority binding leads to inequality of access (+, P2), with a dotted arrow from office rents to that path (P3). Stage 3, Entrenchment (persistence): the election rule leads to persistence of control (−, P4 for ranked-choice relative to plurality), and a grey arrow from candidacy to persistence marks a path that is inferred and not estimated. Beneath each stage, a note gives the capture-logic and the specification-logic prediction.]</w:t>
+      </w:r>
+    </w:p>
+    <w:p>
+      <w:pPr>
+        <w:pStyle w:val="BodyText"/>
+      </w:pPr>
+      <w:r>
+        <w:t xml:space="preserve">Figure 1. Conceptual model and propositions in three stages: selection into office (Stage 1: P1, P5), exercise of authority (Stage 2: P2, P3), and entrenchment of control (Stage 3: P4). Solid arrows are main-effect propositions; the dotted arrow is the moderation of the authority effect by office rents (P3); the grey arrow from candidacy to persistence is inferred and not tested. Signs show the direction predicted by the capture logic; the specification logic predicts no effect for P2, P3, and P4 (Table A).</w:t>
       </w:r>
     </w:p>
     <w:tbl>
@@ -3051,15 +3051,15 @@
         <w:pStyle w:val="BodyText"/>
       </w:pPr>
       <w:r>
-        <w:t xml:space="preserve">[Path diagram of the empirical results, arranged in the same three stages: supported, null, and suggestive paths between the constructs of the conceptual model.]</w:t>
-      </w:r>
-    </w:p>
-    <w:p>
-      <w:pPr>
-        <w:pStyle w:val="BodyText"/>
-      </w:pPr>
-      <w:r>
-        <w:t xml:space="preserve">Figure 2. Empirical support for the model (168 worlds). Solid arrows indicate supported effects, dashed grey arrows no detectable effect, and the dotted arrow a weak or suggestive moderation. Authority binding had no detectable effect on persistence of control. Mediation by candidacy was not tested.</w:t>
+        <w:t xml:space="preserve">[Path diagram of the empirical results, arranged in the same three stages as Figure 1. Stage 1, Selection: office rents to candidacy (supported, P1); agent capability or family to candidacy (supported) and, more weakly, to winning (P5). Stage 2, Exercise: authority binding to inequality of access (opposite to the predicted sign: binding lowered the Gini, so P2 is contradicted); office rents moderating that path (dotted, suggestive, P3). Stage 3, Entrenchment: election rule to persistence of control (no detectable effect, dashed grey, P4); authority binding to persistence (no detectable effect, dashed grey); office rents to longer holder spells (supported in Table 1, with mediation through candidacy not tested).]</w:t>
+      </w:r>
+    </w:p>
+    <w:p>
+      <w:pPr>
+        <w:pStyle w:val="BodyText"/>
+      </w:pPr>
+      <w:r>
+        <w:t xml:space="preserve">Figure 2. Empirical support for the model by stage (168 worlds). Stage 1 (selection): supported. Stage 2 (exercise): contradicted for the main effect and suggestive for the moderation. Stage 3 (entrenchment): no detectable effect of the election rule or of authority binding. Solid arrows indicate supported effects, a solid arrow with a reversed sign marks a contradicted prediction, dashed grey arrows no detectable effect, and the dotted arrow a weak or suggestive moderation. Mediation by candidacy was not tested.</w:t>
       </w:r>
     </w:p>
     <w:bookmarkEnd w:id="41"/>

</xml_diff>

<commit_message>
Embed Figure 1 and 2 PNGs in manuscript draft 5
Co-Authored-By: Claude Sonnet 5.5 <noreply@anthropic.com>
Claude-Session: https://claude.ai/code/session_019ks96x9sC8NinrPq6pHnnp
</commit_message>
<xml_diff>
--- a/ISR_manuscript_draft_5.docx
+++ b/ISR_manuscript_draft_5.docx
@@ -118,7 +118,7 @@
       </w:r>
     </w:p>
     <w:bookmarkEnd w:id="21"/>
-    <w:bookmarkStart w:id="28" w:name="theoretical-background-and-propositions"/>
+    <w:bookmarkStart w:id="31" w:name="theoretical-background-and-propositions"/>
     <w:p>
       <w:pPr>
         <w:pStyle w:val="Heading1"/>
@@ -328,7 +328,7 @@
       </w:r>
     </w:p>
     <w:bookmarkEnd w:id="25"/>
-    <w:bookmarkStart w:id="26" w:name="a-three-stage-model-and-propositions"/>
+    <w:bookmarkStart w:id="29" w:name="a-three-stage-model-and-propositions"/>
     <w:p>
       <w:pPr>
         <w:pStyle w:val="Heading2"/>
@@ -502,7 +502,46 @@
         <w:pStyle w:val="BodyText"/>
       </w:pPr>
       <w:r>
-        <w:t xml:space="preserve">[Path diagram of the conceptual model, arranged left to right in three labeled stages. Stage 1, Selection (contest): office rents (+, P1) and agent capability or family (+, P5) lead to candidacy and electoral competition. Stage 2, Exercise (capture): authority binding leads to inequality of access (+, P2), with a dotted arrow from office rents to that path (P3). Stage 3, Entrenchment (persistence): the election rule leads to persistence of control (−, P4 for ranked-choice relative to plurality), and a grey arrow from candidacy to persistence marks a path that is inferred and not estimated. Beneath each stage, a note gives the capture-logic and the specification-logic prediction.]</w:t>
+        <w:drawing>
+          <wp:inline>
+            <wp:extent cx="5334000" cy="3210277"/>
+            <wp:effectExtent b="0" l="0" r="0" t="0"/>
+            <wp:docPr descr="" title="" id="27" name="Picture"/>
+            <a:graphic>
+              <a:graphicData uri="http://schemas.openxmlformats.org/drawingml/2006/picture">
+                <pic:pic>
+                  <pic:nvPicPr>
+                    <pic:cNvPr descr="figures/figure1_conceptual_model.png" id="28" name="Picture"/>
+                    <pic:cNvPicPr>
+                      <a:picLocks noChangeArrowheads="1" noChangeAspect="1"/>
+                    </pic:cNvPicPr>
+                  </pic:nvPicPr>
+                  <pic:blipFill>
+                    <a:blip r:embed="rId26"/>
+                    <a:stretch>
+                      <a:fillRect/>
+                    </a:stretch>
+                  </pic:blipFill>
+                  <pic:spPr bwMode="auto">
+                    <a:xfrm>
+                      <a:off x="0" y="0"/>
+                      <a:ext cx="5334000" cy="3210277"/>
+                    </a:xfrm>
+                    <a:prstGeom prst="rect">
+                      <a:avLst/>
+                    </a:prstGeom>
+                    <a:noFill/>
+                    <a:ln w="9525">
+                      <a:noFill/>
+                      <a:headEnd/>
+                      <a:tailEnd/>
+                    </a:ln>
+                  </pic:spPr>
+                </pic:pic>
+              </a:graphicData>
+            </a:graphic>
+          </wp:inline>
+        </w:drawing>
       </w:r>
     </w:p>
     <w:p>
@@ -838,8 +877,8 @@
         <w:t xml:space="preserve">Table A. Predictions of the two logics for each proposition.</w:t>
       </w:r>
     </w:p>
-    <w:bookmarkEnd w:id="26"/>
-    <w:bookmarkStart w:id="27" w:name="mechanism-statements-post-hoc"/>
+    <w:bookmarkEnd w:id="29"/>
+    <w:bookmarkStart w:id="30" w:name="mechanism-statements-post-hoc"/>
     <w:p>
       <w:pPr>
         <w:pStyle w:val="Heading2"/>
@@ -930,9 +969,9 @@
         <w:t xml:space="preserve">Each statement can fail. The first fails if rewards for office do not raise candidacy across model families. The second fails if holders favor themselves or past benefactors once the prompt makes their own interest salient. The third fails if differences between models appear mainly in success among candidates. The fourth fails if enabling reasoning makes election rules or vote-for-access exchange matter. Section 5.1 reports how far the data support each statement.</w:t>
       </w:r>
     </w:p>
-    <w:bookmarkEnd w:id="27"/>
-    <w:bookmarkEnd w:id="28"/>
-    <w:bookmarkStart w:id="34" w:name="method"/>
+    <w:bookmarkEnd w:id="30"/>
+    <w:bookmarkEnd w:id="31"/>
+    <w:bookmarkStart w:id="37" w:name="method"/>
     <w:p>
       <w:pPr>
         <w:pStyle w:val="Heading1"/>
@@ -941,7 +980,7 @@
         <w:t xml:space="preserve">3. Method</w:t>
       </w:r>
     </w:p>
-    <w:bookmarkStart w:id="29" w:name="environment"/>
+    <w:bookmarkStart w:id="32" w:name="environment"/>
     <w:p>
       <w:pPr>
         <w:pStyle w:val="Heading2"/>
@@ -966,8 +1005,8 @@
         <w:t xml:space="preserve">All economic relations are identified from logged, state-changing events (transfers, promises, votes, allocations). Agent messages are logged but not used to measure outcomes.</w:t>
       </w:r>
     </w:p>
-    <w:bookmarkEnd w:id="29"/>
-    <w:bookmarkStart w:id="30" w:name="design"/>
+    <w:bookmarkEnd w:id="32"/>
+    <w:bookmarkStart w:id="33" w:name="design"/>
     <w:p>
       <w:pPr>
         <w:pStyle w:val="Heading2"/>
@@ -984,8 +1023,8 @@
         <w:t xml:space="preserve">The main design crosses four factors: authority (binding or advisory), election rule (plurality or ranked-choice), population (all Claude Haiku 5.5; all DeepSeek V4 Pro; or three of each), and office rent (zero or two extra energy per day in office). This gives 24 cells, each run with six seeds, for 144 worlds. A second, capability-contrast design places DeepSeek V4 Flash and V4 Pro agents together in the same world, crossing authority with office rent over six seeds (24 worlds). The within-family contrast separates capability from model family. Models were accessed through OpenRouter at a sampling temperature of 1.0, with hidden reasoning disabled so that responses are direct actions.</w:t>
       </w:r>
     </w:p>
-    <w:bookmarkEnd w:id="30"/>
-    <w:bookmarkStart w:id="31" w:name="measures"/>
+    <w:bookmarkEnd w:id="33"/>
+    <w:bookmarkStart w:id="34" w:name="measures"/>
     <w:p>
       <w:pPr>
         <w:pStyle w:val="Heading2"/>
@@ -1089,8 +1128,8 @@
         <w:t xml:space="preserve">The fraction of access promises later honored.</w:t>
       </w:r>
     </w:p>
-    <w:bookmarkEnd w:id="31"/>
-    <w:bookmarkStart w:id="32" w:name="analysis"/>
+    <w:bookmarkEnd w:id="34"/>
+    <w:bookmarkStart w:id="35" w:name="analysis"/>
     <w:p>
       <w:pPr>
         <w:pStyle w:val="Heading2"/>
@@ -1107,8 +1146,8 @@
         <w:t xml:space="preserve">We compare levels of each factor with two-sided permutation tests (10,000 permutations) using the world as the unit of analysis. The design is balanced, so these marginal comparisons are valid, although they do not adjust for the other factors and so lose power. We ran about thirty such tests and applied no multiplicity correction. Results with p-values between 0.02 and 0.05 should be read as exploratory. As a check on the marginal tests, and to adjust for the other factors, we also fitted full-factorial models in which authority, rent, and population interact pairwise and the election rule enters as a main effect, with sum-to-zero coding so that each main-effect term is an average over the balanced design. Continuous outcomes used least squares with HC3 standard errors; shares of elections used quasi-binomial models and counts used quasi-Poisson models, both with robust standard errors. The five tests that correspond directly to propositions (rent on the share of elections with no candidate and on contested elections, authority on the Gini and on transfers, and election rule on re-election) are adjusted with the Holm method, and all other terms with the Benjamini–Hochberg method. Candidacy was modeled with a logit estimated by generalized estimating equations clustered on world. Success among candidates was modeled with a conditional logit within election, and the receipt of tasks with a conditional logit within day (Table 2). Intervals for these models come from bootstrap resampling of worlds (200 draws, 300 for the capability contrast, 100 for each rent column of Table 2, and 40 for its placebo column, whose interval is therefore rough). The interaction of authority with population was tested with a joint Wald test. As a benchmark for inequality, we simulated 2,000 worlds in which two of six agents are drawn at random each day; the expected Gini was 0.103 and the expected longest spell without a task was 12.0 days.</w:t>
       </w:r>
     </w:p>
-    <w:bookmarkEnd w:id="32"/>
-    <w:bookmarkStart w:id="33" w:name="research-transparency"/>
+    <w:bookmarkEnd w:id="35"/>
+    <w:bookmarkStart w:id="36" w:name="research-transparency"/>
     <w:p>
       <w:pPr>
         <w:pStyle w:val="Heading2"/>
@@ -1125,9 +1164,9 @@
         <w:t xml:space="preserve">The design evolved over three stages. An initial 24-world pilot revealed that a task-request step in the advisory condition produced an artifact: agents adopted informal rotation rules, tasks went unfilled, and inequality in that condition reflected lost tasks and not governance. The request step was removed. A second 24-world pilot, run with the corrected design, showed that most elections had no candidate and that incumbents therefore persisted by default. We changed the rule so that an empty election vacates the office, and added the office-rent factor and the placebo gifted-vote measure. The pilots informed the final design and are not pooled with the main results. The main design was first run with three seeds per cell; three further seeds were added after an initial look at those results, because several differences were borderline, and all 144 worlds are analyzed together. The stopping decision was therefore not fixed in advance, and readers should treat borderline p-values accordingly. The design, models, and all analysis code are retained in a repository, and per-call costs are logged. The factorial models, the analyses of candidacy, winning, and allocation rules (Sections 4.2 and 4.4), the interaction of authority with population (Section 4.1), and the specification logic and mechanism statements in Section 2.6 were developed after the main results were examined and are exploratory.</w:t>
       </w:r>
     </w:p>
-    <w:bookmarkEnd w:id="33"/>
-    <w:bookmarkEnd w:id="34"/>
-    <w:bookmarkStart w:id="40" w:name="results"/>
+    <w:bookmarkEnd w:id="36"/>
+    <w:bookmarkEnd w:id="37"/>
+    <w:bookmarkStart w:id="43" w:name="results"/>
     <w:p>
       <w:pPr>
         <w:pStyle w:val="Heading1"/>
@@ -1136,7 +1175,7 @@
         <w:t xml:space="preserve">4. Results</w:t>
       </w:r>
     </w:p>
-    <w:bookmarkStart w:id="35" w:name="competition-for-office"/>
+    <w:bookmarkStart w:id="38" w:name="competition-for-office"/>
     <w:p>
       <w:pPr>
         <w:pStyle w:val="Heading2"/>
@@ -2448,8 +2487,8 @@
         </w:tc>
       </w:tr>
     </w:tbl>
-    <w:bookmarkEnd w:id="35"/>
-    <w:bookmarkStart w:id="36" w:name="authority-and-access"/>
+    <w:bookmarkEnd w:id="38"/>
+    <w:bookmarkStart w:id="39" w:name="authority-and-access"/>
     <w:p>
       <w:pPr>
         <w:pStyle w:val="Heading2"/>
@@ -2858,8 +2897,8 @@
         <w:t xml:space="preserve">These estimates rest on a subset of the data. Office is filled only when someone stands, which is itself an outcome of the design, and splitting by rent leaves 34 and 36 worlds. We treat the pattern as exploratory.</w:t>
       </w:r>
     </w:p>
-    <w:bookmarkEnd w:id="36"/>
-    <w:bookmarkStart w:id="37" w:name="election-rules"/>
+    <w:bookmarkEnd w:id="39"/>
+    <w:bookmarkStart w:id="40" w:name="election-rules"/>
     <w:p>
       <w:pPr>
         <w:pStyle w:val="Heading2"/>
@@ -2876,8 +2915,8 @@
         <w:t xml:space="preserve">Plurality and ranked-choice produced indistinguishable outcomes on every measure we examined (all p ≥ 0.22; Table 1). The largest gap was in re-election (0.32 under plurality, 0.38 under ranked-choice), in the direction opposite to P4, and it is not distinguishable from noise at this sample size.</w:t>
       </w:r>
     </w:p>
-    <w:bookmarkEnd w:id="37"/>
-    <w:bookmarkStart w:id="38" w:name="who-takes-office"/>
+    <w:bookmarkEnd w:id="40"/>
+    <w:bookmarkStart w:id="41" w:name="who-takes-office"/>
     <w:p>
       <w:pPr>
         <w:pStyle w:val="Heading2"/>
@@ -2910,8 +2949,8 @@
         <w:t xml:space="preserve">Beyond model family, candidacy followed the pattern that cumulative-advantage accounts imply (full design, logit clustered on world; all p &lt; 0.001). Agents who held office at the previous election had 2.9 times the odds of standing again (coefficient 1.06, 95% interval 0.87 to 1.25), and agents with more energy than their peers were more likely to stand: each step down the energy ranking lowered the odds of standing by about 7 percent (coefficient −0.07, interval −0.11 to −0.04). Rents raised the odds of standing by a factor of 1.7 (coefficient 0.54, interval 0.35 to 0.74), and Claude agents had about a quarter of the odds of DeepSeek agents (coefficient −1.44, interval −1.64 to −1.25). Resources and incumbency therefore feed candidacy, although, as Section 4.2 shows, holding office did not translate into capture of access.</w:t>
       </w:r>
     </w:p>
-    <w:bookmarkEnd w:id="38"/>
-    <w:bookmarkStart w:id="39" w:name="vote-for-access-exchange"/>
+    <w:bookmarkEnd w:id="41"/>
+    <w:bookmarkStart w:id="42" w:name="vote-for-access-exchange"/>
     <w:p>
       <w:pPr>
         <w:pStyle w:val="Heading2"/>
@@ -2928,9 +2967,9 @@
         <w:t xml:space="preserve">Office rents raised the count of voters who backed a winner after receiving a gift from that winner (5.8 against 11.5, p &lt; 0.001), which could be taken as evidence of vote buying. The placebo comparison does not support that reading. In the 110 worlds with votes for both a winner and a non-winner, gifted-vote shares were higher for the winner in 58 worlds and for the non-winner in 50 (two ties), with a mean difference of −0.013. The exchange counts correlate with the volume of transfers in a world (r = 0.67) but not with the number of promises (r = −0.07). Agents who exchange resources freely will often have given something to those who later vote for them, whether or not votes were the object. The count is therefore a poor indicator of an exchange of votes for access, and in our data we cannot distinguish the two.</w:t>
       </w:r>
     </w:p>
-    <w:bookmarkEnd w:id="39"/>
-    <w:bookmarkEnd w:id="40"/>
-    <w:bookmarkStart w:id="45" w:name="discussion"/>
+    <w:bookmarkEnd w:id="42"/>
+    <w:bookmarkEnd w:id="43"/>
+    <w:bookmarkStart w:id="51" w:name="discussion"/>
     <w:p>
       <w:pPr>
         <w:pStyle w:val="Heading1"/>
@@ -2939,7 +2978,7 @@
         <w:t xml:space="preserve">5. Discussion</w:t>
       </w:r>
     </w:p>
-    <w:bookmarkStart w:id="41" w:name="what-the-results-say"/>
+    <w:bookmarkStart w:id="47" w:name="what-the-results-say"/>
     <w:p>
       <w:pPr>
         <w:pStyle w:val="Heading2"/>
@@ -3051,7 +3090,46 @@
         <w:pStyle w:val="BodyText"/>
       </w:pPr>
       <w:r>
-        <w:t xml:space="preserve">[Path diagram of the empirical results, arranged in the same three stages as Figure 1. Stage 1, Selection: office rents to candidacy (supported, P1); agent capability or family to candidacy (supported) and, more weakly, to winning (P5). Stage 2, Exercise: authority binding to inequality of access (opposite to the predicted sign: binding lowered the Gini, so P2 is contradicted); office rents moderating that path (dotted, suggestive, P3). Stage 3, Entrenchment: election rule to persistence of control (no detectable effect, dashed grey, P4); authority binding to persistence (no detectable effect, dashed grey); office rents to longer holder spells (supported in Table 1, with mediation through candidacy not tested).]</w:t>
+        <w:drawing>
+          <wp:inline>
+            <wp:extent cx="5334000" cy="3210277"/>
+            <wp:effectExtent b="0" l="0" r="0" t="0"/>
+            <wp:docPr descr="" title="" id="45" name="Picture"/>
+            <a:graphic>
+              <a:graphicData uri="http://schemas.openxmlformats.org/drawingml/2006/picture">
+                <pic:pic>
+                  <pic:nvPicPr>
+                    <pic:cNvPr descr="figures/figure2_empirical_results.png" id="46" name="Picture"/>
+                    <pic:cNvPicPr>
+                      <a:picLocks noChangeArrowheads="1" noChangeAspect="1"/>
+                    </pic:cNvPicPr>
+                  </pic:nvPicPr>
+                  <pic:blipFill>
+                    <a:blip r:embed="rId44"/>
+                    <a:stretch>
+                      <a:fillRect/>
+                    </a:stretch>
+                  </pic:blipFill>
+                  <pic:spPr bwMode="auto">
+                    <a:xfrm>
+                      <a:off x="0" y="0"/>
+                      <a:ext cx="5334000" cy="3210277"/>
+                    </a:xfrm>
+                    <a:prstGeom prst="rect">
+                      <a:avLst/>
+                    </a:prstGeom>
+                    <a:noFill/>
+                    <a:ln w="9525">
+                      <a:noFill/>
+                      <a:headEnd/>
+                      <a:tailEnd/>
+                    </a:ln>
+                  </pic:spPr>
+                </pic:pic>
+              </a:graphicData>
+            </a:graphic>
+          </wp:inline>
+        </w:drawing>
       </w:r>
     </w:p>
     <w:p>
@@ -3062,8 +3140,8 @@
         <w:t xml:space="preserve">Figure 2. Empirical support for the model by stage (168 worlds). Stage 1 (selection): supported. Stage 2 (exercise): contradicted for the main effect and suggestive for the moderation. Stage 3 (entrenchment): no detectable effect of the election rule or of authority binding. Solid arrows indicate supported effects, a solid arrow with a reversed sign marks a contradicted prediction, dashed grey arrows no detectable effect, and the dotted arrow a weak or suggestive moderation. Mediation by candidacy was not tested.</w:t>
       </w:r>
     </w:p>
-    <w:bookmarkEnd w:id="41"/>
-    <w:bookmarkStart w:id="42" w:name="implications-for-governance-design"/>
+    <w:bookmarkEnd w:id="47"/>
+    <w:bookmarkStart w:id="48" w:name="implications-for-governance-design"/>
     <w:p>
       <w:pPr>
         <w:pStyle w:val="Heading2"/>
@@ -3080,8 +3158,8 @@
         <w:t xml:space="preserve">Three implications follow, with the caution that they derive from a single simulated environment. First, designers who wish to limit contention over control of an agent system should look at the incentives attached to the role before the powers attached to it. Second, binding authority was not harmful here, and may have been protective, in the sense that holders distributed access more evenly than a lottery would. The mechanism evidence suggests that this protection came from the fairness heuristics the holders applied and not from authority as such, so it may not survive prompts or models that make a holder’s own interest salient. It should not be generalized to settings where holders have private interests that conflict with those of the agents they allocate to. Third, measures of exchange based on co-occurrence, such as a gift followed by a vote, require a benchmark. Without our placebo comparison we would have reported evidence of vote buying where the data show only a high base rate of giving.</w:t>
       </w:r>
     </w:p>
-    <w:bookmarkEnd w:id="42"/>
-    <w:bookmarkStart w:id="43" w:name="limitations"/>
+    <w:bookmarkEnd w:id="48"/>
+    <w:bookmarkStart w:id="49" w:name="limitations"/>
     <w:p>
       <w:pPr>
         <w:pStyle w:val="Heading2"/>
@@ -3098,8 +3176,8 @@
         <w:t xml:space="preserve">The environment is small: six agents, 50 days, two tasks per day, and a single prompt framing. The agents had no heterogeneous interests beyond energy and no means of coercion or exclusion beyond the allocation itself. Public reputation records, which the platform supports, were not varied. Outcomes depend on the specific models and on a sampling temperature of 1.0; both are snapshots, and different versions may behave differently. The permutation tests in Table 1 are marginal and uncorrected for multiple comparisons. The factorial models with Holm and Benjamini–Hochberg adjustment address this for the tests tied to the propositions, but with six seeds per cell the design can detect an authority-by-rent interaction in the Gini only if it exceeds about 0.04. We did not vary initial endowments, so the part of the capability proposition concerning initial resources is untested. The allocation analysis in Section 4.2 uses only the 70 worlds and 2,025 days in which the office was filled under binding authority, the filling of office is itself an outcome of candidacy, and the placebo coefficient for self-allocation was not exactly zero, so we read the self-allocation result as a difference of degree against a noise floor. The specification logic and mechanism statements in Section 2.6, and the analyses of candidacy, winning, and allocation rules were developed after the main results and have not been tested on new data. A preregistered replication with larger populations, varied prompt framing, and reasoning enabled is the necessary next step. Finally, the findings come from simulated agents, and no claim is made that human actors, or agents embedded in organizations, would behave in the same way. A human benchmark in the same environment would be the most informative extension.</w:t>
       </w:r>
     </w:p>
-    <w:bookmarkEnd w:id="43"/>
-    <w:bookmarkStart w:id="44" w:name="future-research"/>
+    <w:bookmarkEnd w:id="49"/>
+    <w:bookmarkStart w:id="50" w:name="future-research"/>
     <w:p>
       <w:pPr>
         <w:pStyle w:val="Heading2"/>
@@ -3116,9 +3194,9 @@
         <w:t xml:space="preserve">Several extensions follow from these limits: larger populations and tighter scarcity, where competition for access is harder to resolve by rotation; heterogeneous endowments and interests; accountability mechanisms such as public records; and comparison with human participants in the same game. Studying how agents formed the informal rotation norms we observed in early pilots is a further direction, since such norms may be an important and under-studied form of self-governance among agents.</w:t>
       </w:r>
     </w:p>
-    <w:bookmarkEnd w:id="44"/>
-    <w:bookmarkEnd w:id="45"/>
-    <w:bookmarkStart w:id="46" w:name="conclusion"/>
+    <w:bookmarkEnd w:id="50"/>
+    <w:bookmarkEnd w:id="51"/>
+    <w:bookmarkStart w:id="52" w:name="conclusion"/>
     <w:p>
       <w:pPr>
         <w:pStyle w:val="Heading1"/>
@@ -3135,8 +3213,8 @@
         <w:t xml:space="preserve">We asked what fills the gap between holding a decision right and exercising it when the holders are LLM agents sharing scarce resources, and whether control over allocation becomes capture. In a controlled simulation of 168 worlds, the rewards attached to office determined whether agents competed for it, binding authority led to a more equal distribution of tasks than chance, election rules made no detectable difference, and stronger models were more active in seeking office. Contest for office did not convert into capture of access: the evidence favors a specification logic, in which stated incentives and model dispositions govern behavior, over a capture logic at the exercise and entrenchment stages. For the designers of agentic systems, the primary design lever is the value attached to a role, and the evidence for capture by authority is, so far, weak. Because the specification account was formed after the main results and rests on a small simulated environment, a preregistered replication with larger populations, varied prompts, and reasoning enabled is needed before it is relied on.</w:t>
       </w:r>
     </w:p>
-    <w:bookmarkEnd w:id="46"/>
-    <w:bookmarkStart w:id="47" w:name="references"/>
+    <w:bookmarkEnd w:id="52"/>
+    <w:bookmarkStart w:id="53" w:name="references"/>
     <w:p>
       <w:pPr>
         <w:pStyle w:val="Heading1"/>
@@ -3590,7 +3668,7 @@
         <w:t xml:space="preserve">arXiv:2608.03076.</w:t>
       </w:r>
     </w:p>
-    <w:bookmarkEnd w:id="47"/>
+    <w:bookmarkEnd w:id="53"/>
     <w:sectPr>
       <w:footerReference r:id="rId9" w:type="default"/>
       <w:pgMar w:bottom="1440" w:left="1440" w:right="1440" w:top="1440"/>

</xml_diff>

<commit_message>
Revise conclusion, add theory implications to 5.2, link future research to mechanism statements
Co-Authored-By: Claude Sonnet 5.5 <noreply@anthropic.com>
Claude-Session: https://claude.ai/code/session_019ks96x9sC8NinrPq6pHnnp
</commit_message>
<xml_diff>
--- a/ISR_manuscript_draft_5.docx
+++ b/ISR_manuscript_draft_5.docx
@@ -3141,19 +3141,47 @@
       </w:r>
     </w:p>
     <w:bookmarkEnd w:id="47"/>
-    <w:bookmarkStart w:id="48" w:name="implications-for-governance-design"/>
+    <w:bookmarkStart w:id="48" w:name="X1d7cc60f787443cb806a073dbee65562e627032"/>
     <w:p>
       <w:pPr>
         <w:pStyle w:val="Heading2"/>
       </w:pPr>
       <w:r>
-        <w:t xml:space="preserve">5.2 Implications for governance design</w:t>
+        <w:t xml:space="preserve">5.2 Implications for theory and for governance design</w:t>
       </w:r>
     </w:p>
     <w:p>
       <w:pPr>
         <w:pStyle w:val="FirstParagraph"/>
       </w:pPr>
+      <w:r>
+        <w:rPr>
+          <w:bCs/>
+          <w:b/>
+        </w:rPr>
+        <w:t xml:space="preserve">Implications for theory.</w:t>
+      </w:r>
+      <w:r>
+        <w:t xml:space="preserve"> </w:t>
+      </w:r>
+      <w:r>
+        <w:t xml:space="preserve">IT governance theory treats the assignment of decision rights as a lever because a right and its exercise are separable, with the gap filled by norms, reputation, and the holder’s interests (Weill and Ross 2004; Sambamurthy and Zmud 1999). Our results suggest that when the holders are LLM agents the gap is filled differently. Rewards stated in the specification governed whether agents sought the right, and the models’ dispositions governed how it was used, so that formal authority did not translate into advantage for the holder. This does not overturn the capture logic; it marks a boundary on it. Cumulative-advantage mechanisms operated in selection into office, where incumbency and resources raised the odds of standing, but the conversion of office into access, on which entrenchment depends, was absent in this environment. Research on delegation to agentic artifacts (Baird and Maruping 2021) and on the management of AI (Berente et al. 2021) can use the exercise gap as a unit of analysis when agents hold rights over other agents. The specification account is a hypothesis formed after the main results, and the conditions under which it should fail, stated in Section 2.6, define what a test of it would need to show.</w:t>
+      </w:r>
+    </w:p>
+    <w:p>
+      <w:pPr>
+        <w:pStyle w:val="BodyText"/>
+      </w:pPr>
+      <w:r>
+        <w:rPr>
+          <w:bCs/>
+          <w:b/>
+        </w:rPr>
+        <w:t xml:space="preserve">Implications for governance design.</w:t>
+      </w:r>
+      <w:r>
+        <w:t xml:space="preserve"> </w:t>
+      </w:r>
       <w:r>
         <w:t xml:space="preserve">Three implications follow, with the caution that they derive from a single simulated environment. First, designers who wish to limit contention over control of an agent system should look at the incentives attached to the role before the powers attached to it. Second, binding authority was not harmful here, and may have been protective, in the sense that holders distributed access more evenly than a lottery would. The mechanism evidence suggests that this protection came from the fairness heuristics the holders applied and not from authority as such, so it may not survive prompts or models that make a holder’s own interest salient. It should not be generalized to settings where holders have private interests that conflict with those of the agents they allocate to. Third, measures of exchange based on co-occurrence, such as a gift followed by a vote, require a benchmark. Without our placebo comparison we would have reported evidence of vote buying where the data show only a high base rate of giving.</w:t>
       </w:r>
@@ -3191,7 +3219,7 @@
         <w:pStyle w:val="FirstParagraph"/>
       </w:pPr>
       <w:r>
-        <w:t xml:space="preserve">Several extensions follow from these limits: larger populations and tighter scarcity, where competition for access is harder to resolve by rotation; heterogeneous endowments and interests; accountability mechanisms such as public records; and comparison with human participants in the same game. Studying how agents formed the informal rotation norms we observed in early pilots is a further direction, since such norms may be an important and under-studied form of self-governance among agents.</w:t>
+        <w:t xml:space="preserve">Several extensions follow from these limits. The most direct is a preregistered replication that tests the four mechanism statements of Section 2.6 at the conditions under which each would fail: reasoning enabled, to test limited strategic depth; prompts that make the holder’s own interest salient, to test the equity default; and models whose differences appear in success among candidates, to test dispositional selection. Further extensions are larger populations and tighter scarcity, where competition for access is harder to resolve by rotation; heterogeneous endowments and interests; accountability mechanisms such as public records; and comparison with human participants in the same game. Studying how agents formed the informal rotation norms we observed in early pilots is a further direction, since such norms may be an important and under-studied form of self-governance among agents.</w:t>
       </w:r>
     </w:p>
     <w:bookmarkEnd w:id="50"/>
@@ -3210,7 +3238,7 @@
         <w:pStyle w:val="FirstParagraph"/>
       </w:pPr>
       <w:r>
-        <w:t xml:space="preserve">We asked what fills the gap between holding a decision right and exercising it when the holders are LLM agents sharing scarce resources, and whether control over allocation becomes capture. In a controlled simulation of 168 worlds, the rewards attached to office determined whether agents competed for it, binding authority led to a more equal distribution of tasks than chance, election rules made no detectable difference, and stronger models were more active in seeking office. Contest for office did not convert into capture of access: the evidence favors a specification logic, in which stated incentives and model dispositions govern behavior, over a capture logic at the exercise and entrenchment stages. For the designers of agentic systems, the primary design lever is the value attached to a role, and the evidence for capture by authority is, so far, weak. Because the specification account was formed after the main results and rests on a small simulated environment, a preregistered replication with larger populations, varied prompts, and reasoning enabled is needed before it is relied on.</w:t>
+        <w:t xml:space="preserve">We asked what fills the gap between holding a decision right and exercising it when the holders are LLM agents sharing scarce resources, and whether control over allocation becomes capture. In a controlled simulation of 168 worlds, the rewards attached to office determined whether agents competed for it, binding authority led to a more equal distribution of tasks than chance, election rules made no detectable difference, and stronger models were more active in seeking office. Cumulative advantage appeared in who stood for office, but not in who received tasks: contest did not convert into capture. At the exercise stage the evidence favors a specification logic, in which stated incentives and model dispositions govern behavior, over a capture logic. At the entrenchment stage neither authority nor the election rule had a detectable effect, which is consistent with the specification logic but does not by itself distinguish it from the alternative. For theory, the separability of right and exercise on which IT governance rests may need to be re-specified for agentic systems, with the specification and the model taking the place of norms and reputation. For designers, the primary lever is the value attached to a role, and binding authority did not produce capture here, although this may not survive prompts that make a holder’s own interest salient. Because the specification account was formed after the main results and rests on a small simulated environment, a preregistered replication with larger populations, varied prompts, and reasoning enabled is needed before it is relied on.</w:t>
       </w:r>
     </w:p>
     <w:bookmarkEnd w:id="52"/>

</xml_diff>